<commit_message>
Add KWA board reporting and mixed-pressure runs
</commit_message>
<xml_diff>
--- a/data/knowledge_work/artifact_goldens/kwa_jobs_tailored_packet__application_packet.docx
+++ b/data/knowledge_work/artifact_goldens/kwa_jobs_tailored_packet__application_packet.docx
@@ -23,6 +23,33 @@
         <w:t>Tailor a seeded application packet from a job brief and user materials, then produce a submission memo.</w:t>
       </w:r>
     </w:p>
+    <w:p>
+      <w:pPr>
+        <w:pStyle w:val="Heading2"/>
+      </w:pPr>
+      <w:r>
+        <w:t>Brief</w:t>
+      </w:r>
+    </w:p>
+    <w:p/>
+    <w:p>
+      <w:pPr>
+        <w:pStyle w:val="Heading2"/>
+      </w:pPr>
+      <w:r>
+        <w:t>Form Fields</w:t>
+      </w:r>
+    </w:p>
+    <w:p/>
+    <w:p>
+      <w:pPr>
+        <w:pStyle w:val="Heading2"/>
+      </w:pPr>
+      <w:r>
+        <w:t>Response Summary</w:t>
+      </w:r>
+    </w:p>
+    <w:p/>
     <w:p>
       <w:pPr>
         <w:pStyle w:val="Heading2"/>

</xml_diff>